<commit_message>
BD Ramses VI: line-by-line review of all episode scripts
Fixes: sun (not Khepri) speaks in Book of the Earth 6.16; lid face is
conglomerate, not granite; Shabaka stone vs text dating; no projection
onto painted walls; unsourced claims softened (star count, KV12 age,
two-Nut reading, Geb arms position); Pleuger/Roberson attribution;
painting technique left unverified; continuity details.

Co-Authored-By: Claude Opus 5.5 <noreply@anthropic.com>
Claude-Session: https://claude.ai/code/session_01H2PFDoyRtRCUBFvrWqzADJ
</commit_message>
<xml_diff>
--- a/bd/ramses-vi/Scenario_Volume_1_Les_Mysteres_du_tombeau_de_Ramses_VI.docx
+++ b/bd/ramses-vi/Scenario_Volume_1_Les_Mysteres_du_tombeau_de_Ramses_VI.docx
@@ -4787,17 +4787,7 @@
         <w:t xml:space="preserve">Case 2</w:t>
       </w:r>
       <w:r>
-        <w:t xml:space="preserve"> (grande case) — Dans le corridor, des artisans au travail : un tailleur de pierre, un dessinateur qui trace à l'ocre rouge une esquisse sur l'enduit, un peintre qui reprend au noir, un porteur de lampe. </w:t>
-      </w:r>
-      <w:r>
-        <w:rPr>
-          <w:b/>
-          <w:bCs/>
-        </w:rPr>
-        <w:t xml:space="preserve">[H]</w:t>
-      </w:r>
-      <w:r>
-        <w:t xml:space="preserve"> pour les métiers et techniques (esquisse rouge, correction noire) — à documenter ; </w:t>
+        <w:t xml:space="preserve"> (grande case) — Dans le corridor, des artisans au travail : un tailleur de pierre, un dessinateur qui trace une esquisse sur l'enduit, un peintre qui pose la couleur, un porteur de lampe. </w:t>
       </w:r>
       <w:r>
         <w:rPr>
@@ -4807,7 +4797,17 @@
         <w:t xml:space="preserve">[F]</w:t>
       </w:r>
       <w:r>
-        <w:t xml:space="preserve"> pour les individus.</w:t>
+        <w:t xml:space="preserve"> pour les individus ; la technique précise (couleurs de l'esquisse, étapes) n'est </w:t>
+      </w:r>
+      <w:r>
+        <w:rPr>
+          <w:b/>
+          <w:bCs/>
+        </w:rPr>
+        <w:t xml:space="preserve">pas encore vérifiée</w:t>
+      </w:r>
+      <w:r>
+        <w:t xml:space="preserve"> : la dessiner seulement après confirmation (Laboury, Keller).</w:t>
       </w:r>
     </w:p>
     <w:p>
@@ -6394,7 +6394,7 @@
           <w:sz w:val="21"/>
           <w:szCs w:val="21"/>
         </w:rPr>
-        <w:t xml:space="preserve"> : Il y en a des centaines.</w:t>
+        <w:t xml:space="preserve"> : Il y en a partout.</w:t>
       </w:r>
     </w:p>
     <w:p>
@@ -9698,7 +9698,7 @@
           <w:sz w:val="21"/>
           <w:szCs w:val="21"/>
         </w:rPr>
-        <w:t xml:space="preserve"> : La chambre J. Plus petite que prévu, d'ailleurs. Et deux de ces piliers n'ont jamais été dégagés.</w:t>
+        <w:t xml:space="preserve"> : La chambre J. Plus petite que prévu, d'ailleurs. Et deux de ces piliers n'ont jamais été entièrement dégagés de la roche.</w:t>
       </w:r>
     </w:p>
     <w:p>
@@ -17897,7 +17897,7 @@
           <w:sz w:val="21"/>
           <w:szCs w:val="21"/>
         </w:rPr>
-        <w:t xml:space="preserve"> : Mais tu n'as pas tort de chercher la rencontre. Elle existe, dans KV9. Pas sur ce mur.</w:t>
+        <w:t xml:space="preserve"> : Mais tu n'as pas tort de chercher la rencontre. Un autre livre peint dans ce tombeau la raconte : l'Amdouat. Pas sur ce mur.</w:t>
       </w:r>
     </w:p>
     <w:p>
@@ -18965,7 +18965,7 @@
         <w:t xml:space="preserve">Case 5</w:t>
       </w:r>
       <w:r>
-        <w:t xml:space="preserve"> — Remontée rapide dans le corridor. À l'entrée, sous la grille, Julien Marsac attend, la tablette de Maya à la main (elle reçoit les données du scan en direct). </w:t>
+        <w:t xml:space="preserve"> — Remontée rapide dans le corridor. À l'entrée, sous la grille, Julien Marsac attend devant un écran relié au scanner de Maya (il reçoit les données du scan en direct). </w:t>
       </w:r>
       <w:r>
         <w:rPr>
@@ -21044,7 +21044,7 @@
           <w:sz w:val="21"/>
           <w:szCs w:val="21"/>
         </w:rPr>
-        <w:t xml:space="preserve"> : Ici, « le cadavre de Celle qui détruit ». Et du disque sort Khépri, le scarabée. Il dit :</w:t>
+        <w:t xml:space="preserve"> : Ici, « le cadavre de Celle qui détruit ». Du disque sort Khépri, le scarabée. Et le soleil dit :</w:t>
       </w:r>
     </w:p>
     <w:p>
@@ -21116,6 +21116,14 @@
         </w:rPr>
         <w:t xml:space="preserve">V</w:t>
       </w:r>
+      <w:r>
+        <w:rPr>
+          <w:color w:val="5A5A5A"/>
+          <w:sz w:val="18"/>
+          <w:szCs w:val="18"/>
+        </w:rPr>
+        <w:t xml:space="preserve"> — Locuteur : « le soleil » (bible 02 §5), pas Khépri nommément : garder « le soleil » dans toutes les bulles.</w:t>
+      </w:r>
     </w:p>
     <w:p>
       <w:pPr>
@@ -21710,7 +21718,7 @@
           <w:sz w:val="21"/>
           <w:szCs w:val="21"/>
         </w:rPr>
-        <w:t xml:space="preserve">Khépri</w:t>
+        <w:t xml:space="preserve">Le soleil</w:t>
       </w:r>
       <w:r>
         <w:rPr>
@@ -22388,7 +22396,7 @@
         <w:t xml:space="preserve">Case 7</w:t>
       </w:r>
       <w:r>
-        <w:t xml:space="preserve"> — Nefertari, la main sur la paroi de H (sans la toucher), le regard vers le fond du tombeau. </w:t>
+        <w:t xml:space="preserve"> — Nefertari, la main levée vers la paroi de H (sans la toucher), le regard vers le fond du tombeau. </w:t>
       </w:r>
       <w:r>
         <w:rPr>
@@ -22705,7 +22713,7 @@
         <w:spacing w:after="60" w:line="264"/>
       </w:pPr>
       <w:r>
-        <w:t xml:space="preserve">Dans le Livre de la Terre de la chambre J : un grand disque est embrassé par des bras sortant du sol, avec 12 étoiles et 12 disques ([DARNELL] §6.3) ; les « deux bras de Noun » soulèvent le disque (§6.11, 6.40) ; Khépri sort du disque et dit : « Moi-même, je me mets au monde » (§6.16).</w:t>
+        <w:t xml:space="preserve">Dans le Livre de la Terre de la chambre J : un grand disque est embrassé par des bras sortant du sol, avec 12 étoiles et 12 disques ([DARNELL] §6.3) ; les « deux bras de Noun » soulèvent le disque (§6.11, 6.40) ; Khépri sort du disque, et le soleil dit : « Moi-même, je me mets au monde » (§6.16).</w:t>
       </w:r>
     </w:p>
     <w:p>
@@ -23214,7 +23222,17 @@
         <w:t xml:space="preserve">Case 2</w:t>
       </w:r>
       <w:r>
-        <w:t xml:space="preserve"> — Maya projette sur la paroi, en lumière douce, le calque du plan TMP : KV9 en bleu, KV12 en orange. Le point de contact se trouve au sud du linteau de la porte I. </w:t>
+        <w:t xml:space="preserve"> — Maya déplie son écran portable, </w:t>
+      </w:r>
+      <w:r>
+        <w:rPr>
+          <w:b/>
+          <w:bCs/>
+        </w:rPr>
+        <w:t xml:space="preserve">dos à la paroi</w:t>
+      </w:r>
+      <w:r>
+        <w:t xml:space="preserve"> (jamais de projection sur la peinture, voir épisode 2), et affiche le calque du plan TMP : KV9 en bleu, KV12 en orange. Le point de contact se trouve au sud du linteau de la porte I. </w:t>
       </w:r>
       <w:r>
         <w:rPr>
@@ -29266,7 +29284,7 @@
           <w:sz w:val="21"/>
           <w:szCs w:val="21"/>
         </w:rPr>
-        <w:t xml:space="preserve"> : Donc plus récente que notre Ramsès VI, qui est de la XXᵉ. La datation se discute encore… mais pas dans le sens qui vous arrange.</w:t>
+        <w:t xml:space="preserve"> : La pierre elle-même est bien plus récente que notre Ramsès VI. Le texte qu'elle copie, on en discute encore… mais pas dans le sens qui vous arrange.</w:t>
       </w:r>
     </w:p>
     <w:p>
@@ -31681,7 +31699,7 @@
         <w:t xml:space="preserve">Case 7</w:t>
       </w:r>
       <w:r>
-        <w:t xml:space="preserve"> — Case documentaire en sépia (sans liseré doré) : le visage de granit, seul, sur fond neutre ; légende manuscrite.</w:t>
+        <w:t xml:space="preserve"> — Case documentaire en sépia (sans liseré doré) : le visage de conglomérat, seul, sur fond neutre ; légende manuscrite.</w:t>
       </w:r>
     </w:p>
     <w:p>
@@ -33596,7 +33614,7 @@
         <w:spacing w:after="60" w:line="264"/>
       </w:pPr>
       <w:r>
-        <w:t xml:space="preserve">Les personnages, la minute de silence de Kerbu, le geste de Maya sur la réplique.</w:t>
+        <w:t xml:space="preserve">Les personnages, la minute de silence de Kerbu, l'observation de la réplique par Maya.</w:t>
       </w:r>
     </w:p>
     <w:p>
@@ -34024,7 +34042,17 @@
         <w:t xml:space="preserve">Case 1</w:t>
       </w:r>
       <w:r>
-        <w:t xml:space="preserve"> (bandeau) — Chambre J. Maya dispose quatre petits projecteurs au sol, câbles soigneusement rangés, tablette sur les genoux. </w:t>
+        <w:t xml:space="preserve"> (bandeau) — Chambre J. Maya déplie deux grands écrans portables au centre de la salle, </w:t>
+      </w:r>
+      <w:r>
+        <w:rPr>
+          <w:b/>
+          <w:bCs/>
+        </w:rPr>
+        <w:t xml:space="preserve">dos aux parois</w:t>
+      </w:r>
+      <w:r>
+        <w:t xml:space="preserve"> (jamais de projection sur la peinture), câbles soigneusement rangés, tablette sur les genoux. </w:t>
       </w:r>
       <w:r>
         <w:rPr>
@@ -34210,7 +34238,7 @@
         <w:t xml:space="preserve">Case 3</w:t>
       </w:r>
       <w:r>
-        <w:t xml:space="preserve"> (grande case) — Le panorama s'allume sur la paroi d'un projecteur (ou sur la tablette) : les parois de J « déroulées » à plat, des étiquettes lumineuses posées dessus.</w:t>
+        <w:t xml:space="preserve"> (grande case) — Le panorama s'allume sur les écrans : les parois de J « déroulées » à plat, des étiquettes lumineuses posées dessus.</w:t>
       </w:r>
     </w:p>
     <w:p>
@@ -35537,7 +35565,7 @@
           <w:sz w:val="21"/>
           <w:szCs w:val="21"/>
         </w:rPr>
-        <w:t xml:space="preserve"> : Roberson parle d'un « ensemble modulable ». Et chaque tombe arrange le livre à sa façon : l'Osireion d'Abydos, la tombe de Mérenptah, celle de Ramsès VII…</w:t>
+        <w:t xml:space="preserve"> : Pour Roberson, résume Pleuger, c'est un « ensemble modulable ». Et chaque tombe arrange le livre à sa façon : l'Osireion d'Abydos, la tombe de Mérenptah, celle de Ramsès VII…</w:t>
       </w:r>
     </w:p>
     <w:p>
@@ -36546,7 +36574,7 @@
           <w:sz w:val="21"/>
           <w:szCs w:val="21"/>
         </w:rPr>
-        <w:t xml:space="preserve"> : Les oiseaux-ba qui halent la barque. Et dessous, les « bras de Geb ».</w:t>
+        <w:t xml:space="preserve"> : Les oiseaux-ba qui halent la barque. Et autour du tertre, les « bras de Geb ».</w:t>
       </w:r>
     </w:p>
     <w:p>
@@ -37771,7 +37799,7 @@
           <w:sz w:val="21"/>
           <w:szCs w:val="21"/>
         </w:rPr>
-        <w:t xml:space="preserve"> : Un pour le jour, un pour la nuit. Nout avale le soleil le soir et le remet au monde le matin. Tu l'as déjà vue, au plafond du corridor D.</w:t>
+        <w:t xml:space="preserve"> : Le Livre du Jour d'un côté, le Livre de la Nuit de l'autre. Nout avale le soleil le soir et le remet au monde le matin. Tu l'as déjà vue, au plafond du corridor D.</w:t>
       </w:r>
     </w:p>
     <w:p>
@@ -38862,7 +38890,7 @@
           <w:sz w:val="21"/>
           <w:szCs w:val="21"/>
         </w:rPr>
-        <w:t xml:space="preserve"> : Et personne ne le sait. C'est toi-même qui me l'as appris, nuit 3.</w:t>
+        <w:t xml:space="preserve"> : Et personne ne le sait. Nefertari nous l'a montré, nuit 3.</w:t>
       </w:r>
     </w:p>
     <w:p>
@@ -42572,7 +42600,7 @@
         <w:t xml:space="preserve">Case 2</w:t>
       </w:r>
       <w:r>
-        <w:t xml:space="preserve"> — Maya projette son modèle 3D : les heures de l'Amdouat s'allument une à une le long de G et H ; à la place de la 12ᵉ, une case vide. </w:t>
+        <w:t xml:space="preserve"> — Maya affiche son modèle 3D sur sa tablette : les heures de l'Amdouat s'allument une à une le long de G et H ; à la place de la 12ᵉ, une case vide. </w:t>
       </w:r>
       <w:r>
         <w:rPr>
@@ -43110,7 +43138,7 @@
           <w:sz w:val="21"/>
           <w:szCs w:val="21"/>
         </w:rPr>
-        <w:t xml:space="preserve"> : Je peux toutes les afficher. Piankoff part du nord et finit en D16. Hornung et Roberson finissent en A12. Barta ne voit pas de scène finale nette. Pleuger finit ici, en K.</w:t>
+        <w:t xml:space="preserve"> : Je peux toutes les afficher. Piankoff part du nord et finit en D16. Hornung et Roberson finissent en A12. Barta ne voit pas de scène finale nette. Pleuger propose de finir ici, en K.</w:t>
       </w:r>
     </w:p>
     <w:p>
@@ -45544,7 +45572,7 @@
         <w:spacing w:after="60" w:line="264"/>
       </w:pPr>
       <w:r>
-        <w:t xml:space="preserve">En creusant, les ouvriers ont percé une tombe plus ancienne, KV12 ; la brèche a été rebouchée. [TMP]</w:t>
+        <w:t xml:space="preserve">En creusant, les ouvriers ont percé une tombe voisine, KV12 ; la brèche a été rebouchée. [TMP]</w:t>
       </w:r>
     </w:p>
     <w:p>

</xml_diff>